<commit_message>
Update PBPK workflows, simulations, and manuscript
</commit_message>
<xml_diff>
--- a/07_Docs/Manuscript/1_Revision/Responses_ReviewComments.docx
+++ b/07_Docs/Manuscript/1_Revision/Responses_ReviewComments.docx
@@ -44,19 +44,6 @@
       </w:pPr>
       <w:r>
         <w:rPr/>
-        <w:t>Review text</w:t>
-      </w:r>
-    </w:p>
-    <w:p>
-      <w:pPr>
-        <w:pStyle w:val="BodyText"/>
-        <w:bidi w:val="0"/>
-        <w:spacing w:lineRule="auto" w:line="264" w:before="0" w:after="100"/>
-        <w:jc w:val="start"/>
-        <w:rPr/>
-      </w:pPr>
-      <w:r>
-        <w:rPr/>
         <w:t>The authors present the results of a study presenting a new approach methodology (NAM) framework to physiologically-based pharmacokinetic modeling (PBPK) for monoclonal antibodies (MABs). Using a retrospective approach, the authors leveraged published in vitro, in vivo monkey, and in vivo human data for 8 MABs to developed an “a priori” PBPK modeling approach and top-down TMDD modeling approach to MAB model development. The work also uses the TMDD model to examine the potential for animal sampling times and number of animals to inform the proposed NAM PBPK program. Overall, this is an important concept and will benefit readers working in this space, however, the manuscript needs some restructuring and clarification in order to be a truly valuable contribution to the field.  </w:t>
       </w:r>
     </w:p>
@@ -72,9 +59,10 @@
       </w:pPr>
       <w:r>
         <w:rPr>
-          <w:color w:val="0046B4"/>
-        </w:rPr>
-        <w:t>We have now restructured the paper as a tutorial and strengthened the connection between its two practical tasks: generating monkey and human PBPK predictions without calibration using in vivo PK data, and using uncertainty and population simulations to inform an exploratory, reduced size, monkey PK study design. We have made improved clarity throughout the paper.</w:t>
+          <w:b w:val="false"/>
+          <w:color w:val="0046B4"/>
+        </w:rPr>
+        <w:t>We have restructured the manuscript as an tutorial and strengthened the connection between its two practical tasks: generating monkey and human PBPK predictions without calibration to the analyzed in vivo PK profiles, and using model-conditional uncertainty and population simulations to evaluate candidate monkey PK study designs. The monkey-fitted top-down TMDD component in the submitted manuscript was removed so the revised article could focus on a transparent, reproducible PK-Sim/MoBi-R workflow.</w:t>
       </w:r>
     </w:p>
     <w:p>
@@ -121,9 +109,10 @@
       </w:pPr>
       <w:r>
         <w:rPr>
-          <w:color w:val="0046B4"/>
-        </w:rPr>
-        <w:t>We updated both objectives at the end of the Introduction. The objectives now read as follows: “The primary objectives are (1) to demonstrate how to generate PBPK prediction without in vivo PK data of monkey and human PK using PK-Sim/MoBi; and (2) to explore animal number reduction opportunities for  monkey PK studies for mAbs using the developed PBPK models. A secondary objective is to evaluate the workflow retrospectively using eight intravenously administered mAbs across five targets. The analysis assesses predictive performance and uses simulation-based visualizations to show how uncertainty in in vitro inputs and interindividual variability affect confidence that data generated by candidate study designs can recover molecule’s “true” PK characteristics.” This revision makes the animal-number reduction objective explicit and identified the eight mAbs evaluation as a secondary, retrospective analysis.</w:t>
+          <w:b w:val="false"/>
+          <w:color w:val="0046B4"/>
+        </w:rPr>
+        <w:t>We revised the objectives at the end of the Introduction. The primary objectives are now to demonstrate how to generate monkey and human PBPK predictions in PK-Sim/MoBi without calibration to the analyzed in vivo PK profiles and to explore opportunities to reduce animal numbers in monkey PK studies using those models. The eight-mAb retrospective evaluation is identified as a secondary objective, and the study-design exercise is described explicitly as recovery of model-defined PK characteristics under prespecified assumptions.</w:t>
       </w:r>
     </w:p>
     <w:p>
@@ -205,9 +194,10 @@
       </w:pPr>
       <w:r>
         <w:rPr>
-          <w:color w:val="0046B4"/>
-        </w:rPr>
-        <w:t>Because the manuscript is now presented as a tutorial, we restructured it accordingly. Step-by-step implementation workflow now appears in the Overview section, quantitative findings are reported in the Predictive Performance and Interpretation subsections, and the expanded Application and Key Considerations section contains the broader interpretation, practical choices, and limitations.</w:t>
+          <w:b w:val="false"/>
+          <w:color w:val="0046B4"/>
+        </w:rPr>
+        <w:t>Because the manuscript is now presented as a tutorial, we reorganized the material so that implementation steps are described in the Overview, Configuring Target-Specific PBPK Models, Running Simulations, and Evaluation of Simulation-Based Study Designs sections; quantitative findings are reported in Predictive Performance, Within-Target Comparisons, and Study Design Simulation Results; and interpretation, practical choices, and limitations are concentrated in Application and Key Considerations.</w:t>
       </w:r>
     </w:p>
     <w:p>
@@ -233,9 +223,10 @@
       </w:pPr>
       <w:r>
         <w:rPr>
-          <w:color w:val="0046B4"/>
-        </w:rPr>
-        <w:t>The main text now includes more detail about the workflow in the GitHub repository and directs readers to the relevant folders at each step. Specifically, the model-building, prediction, and study-simulation sections point to the 01_Models, 02_APriori_PBPK_Workflow, and 03_Study_Simulations folders in Supplementary Material 1. The supplement provides README instructions for the key tasks and the executable code needed to reproduce the analyses.</w:t>
+          <w:b w:val="false"/>
+          <w:color w:val="0046B4"/>
+        </w:rPr>
+        <w:t>The main text now summarizes the repository workflow and directs readers to the 01_Models, 02_APriori_PBPK_Workflow, and 03_Study_Simulations folders at the relevant steps. We also added the TMDD reaction scheme and rate laws, a compact mapping of the six mechanistic inputs to their exact PK-Sim/MoBi parameter paths and units, and a minimal esqlabsR execution excerpt. The repository is version-tagged as v0.1.0, and Supplementary Material 1 contains the complete validated scripts, workbooks, and instructions.</w:t>
       </w:r>
     </w:p>
     <w:p>
@@ -274,9 +265,10 @@
       </w:pPr>
       <w:r>
         <w:rPr>
-          <w:color w:val="0046B4"/>
-        </w:rPr>
-        <w:t>The revised Methods now explain that observed and predicted AUC0-tlast were calculated over the same interval, from time zero to the last observed sampling time, after the predicted profile was interpolated to the observed sampling times. Both profiles used the same linear-up/log-down trapezoidal rule. Clearance was calculated as dose divided by AUCinf and reflects total systemic elimination, including any target-mediated contribution. Because AUCinf depends on terminal-phase estimation, observed clearance was considered evaluable only when the extrapolated fraction of AUCinf was no greater than 20%; profiles above this threshold were marked not evaluable and excluded from clearance accuracy calculations.</w:t>
+          <w:b w:val="false"/>
+          <w:color w:val="0046B4"/>
+        </w:rPr>
+        <w:t>The revised Methods explain that observed and predicted AUC0-tlast were calculated over the same interval, from time zero to the last observed sampling time, after interpolation of the predicted profile to the observed times. Both profiles used the same linear-up/log-down trapezoidal rule. Clearance was calculated as dose divided by AUCinf and reflects total systemic elimination, including any target-mediated contribution. Observed clearance was considered evaluable only when the extrapolated fraction of AUCinf was no greater than 20%; profiles above this threshold were excluded from clearance accuracy calculations. Applying the matched AUC interval changed the number of predictions within two-fold from 8/14 to 12/14 in monkeys and from 25/30 to 29/30 in humans. Under the clearance rule, 6/14 monkey and 15/30 human profiles were evaluable, of which 3/6 and 10/15, respectively, were within two-fold.</w:t>
       </w:r>
     </w:p>
     <w:p>
@@ -365,9 +357,10 @@
       </w:pPr>
       <w:r>
         <w:rPr>
-          <w:color w:val="0046B4"/>
-        </w:rPr>
-        <w:t>We agree that PBPK/TMDD methods are well established, and the revised Introduction now describes the article as applying established methods within a NAM decision framework rather than presenting a new modeling method. Based on the reviewer’s feedback, the paper is now structured and written as a tutorial. It shows how to link six mechanistic in vitro inputs, target- and species-specific PBPK models, predictions without calibration with in vivo PK data, and variability and uncertainty simulations to the design of exploratory mAb PK studies. The expanded Application and Key Considerations section states this practical contribution and discusses the current limitations.</w:t>
+          <w:b w:val="false"/>
+          <w:color w:val="0046B4"/>
+        </w:rPr>
+        <w:t>We agree that PBPK/TMDD methods are well established, and the revised Introduction presents the article as an application of established methods within a NAM decision framework rather than as a new modeling method. The manuscript is now an implementation-focused tutorial linking six mechanistic inputs, target- and species-specific PBPK models, predictions without calibration to the analyzed in vivo profiles, and model-conditional study-design simulations. We added the suggested Glassman and Chen references and now also cite and discuss Stader et al. (2025).</w:t>
       </w:r>
     </w:p>
     <w:p>
@@ -393,9 +386,10 @@
       </w:pPr>
       <w:r>
         <w:rPr>
-          <w:color w:val="0046B4"/>
-        </w:rPr>
-        <w:t>We replaced the repeated use of “a priori” in the main description of the prediction exercise with “without calibration to the analyzed in vivo PK data.” The revised text identifies which mechanistic inputs were obtained from prior modeling studies because direct experimental values were unavailable, including FcRn affinity estimates and several target-system parameters. The Application and Key Considerations section also explains that these inputs may carry information from earlier in vivo analyses; therefore, the retrospective results should not be interpreted as a fully independent prospective test based only on in vitro evidence.</w:t>
+          <w:b w:val="false"/>
+          <w:color w:val="0046B4"/>
+        </w:rPr>
+        <w:t>We replaced narrative use of 'a priori' with 'without calibration to the analyzed in vivo PK data' and identify which inputs came from prior modeling rather than independent experiments. We now state that the human-derived default FcRn Kd of 1.07 µmol/L came from Benamara et al.'s 50-mAb dataset and that adalimumab, bevacizumab, and golimumab both receive that default here and were included in the source dataset. Because the final default was calculated from the full dataset, the corresponding human evaluations are not fully independent. We also discuss the use of the same default in monkeys and contrast it with Stader et al.'s cross-species FcRn scaling and additional systemic-clearance term.</w:t>
       </w:r>
     </w:p>
     <w:p>
@@ -449,30 +443,26 @@
       </w:pPr>
       <w:r>
         <w:rPr>
-          <w:color w:val="0046B4"/>
-        </w:rPr>
-        <w:t>We added a new Within-Target Comparisons subsection that compares antibodies sharing PD-L1, PD-1, and TNFα, including matched-dose results where available.</w:t>
-      </w:r>
-    </w:p>
-    <w:p>
-      <w:pPr>
-        <w:pStyle w:val="BodyText"/>
-        <w:bidi w:val="0"/>
-        <w:spacing w:lineRule="auto" w:line="264" w:before="0" w:after="100"/>
-        <w:jc w:val="start"/>
-        <w:rPr/>
-      </w:pPr>
-      <w:r>
-        <w:rPr>
-          <w:color w:val="0046B4"/>
-        </w:rPr>
-        <w:t xml:space="preserve"> </w:t>
-      </w:r>
-      <w:r>
-        <w:rPr>
-          <w:color w:val="0046B4"/>
-        </w:rPr>
-        <w:t>We did not expand the antibody set because the analysis relied on publicly available monkey PK, human PK, and mechanistic input data. The revised Application and Key Considerations section identifies a larger retrospective set, including multiple antibodies per target and less-characterized targets, as a next step. As suggested by Reviewer 2, we re-framed the manuscript as an implementation-focused tutorial, with the workflow rather than broad validation as its main contribution.</w:t>
+          <w:b w:val="false"/>
+          <w:color w:val="0046B4"/>
+        </w:rPr>
+        <w:t>We added a Within-Target Comparisons subsection for PD-L1, PD-1, and TNFα and expanded it to interpret the comparisons mechanistically. Because target reference concentration and target degradation rate were shared within a target, divergent results cannot be assigned to those shared inputs alone and instead point toward molecule-specific FcRn binding, target-binding kinetics, internalization, unmodeled antibody properties, or differences in the literature data context. We qualify these as hypotheses rather than causal conclusions.</w:t>
+      </w:r>
+    </w:p>
+    <w:p>
+      <w:pPr>
+        <w:pStyle w:val="BodyText"/>
+        <w:bidi w:val="0"/>
+        <w:spacing w:lineRule="auto" w:line="264" w:before="0" w:after="100"/>
+        <w:jc w:val="start"/>
+        <w:rPr/>
+      </w:pPr>
+      <w:r>
+        <w:rPr>
+          <w:b w:val="false"/>
+          <w:color w:val="0046B4"/>
+        </w:rPr>
+        <w:t>We did not expand the antibody set because the analysis relied on publicly available monkey PK, human PK, and mechanistic input data. The Application and Key Considerations section identifies a larger retrospective set, including multiple antibodies per target and less-characterized targets, as a next step. The revised article is therefore positioned as an implementation tutorial and retrospective illustration rather than a broad validation study.</w:t>
       </w:r>
     </w:p>
     <w:p>
@@ -500,9 +490,24 @@
       </w:pPr>
       <w:r>
         <w:rPr>
-          <w:color w:val="0046B4"/>
-        </w:rPr>
-        <w:t>The eight-antibody analysis is now positioned as a retrospective illustration, without a claim of method novelty or broad validation. The revised manuscript now places the model-informed design alongside current practices, including fewer dose groups, microsampling, cassette dosing, animal reuse, and PK/TK sampling embedded in other studies. It also explains that anti-drug antibodies, biological variability, and additional pharmacodynamic or safety objectives may require more animals. The 15-animal design is now described only as the modeled five-dose comparator, not as a universal representation of current industry practice, and human FcRn transgenic mice are discussed as a potential alternative that was not tested here.</w:t>
+          <w:b w:val="false"/>
+          <w:color w:val="0046B4"/>
+        </w:rPr>
+        <w:t xml:space="preserve">We completely redesigned the study-size analysis after removing the top-down component. The revised exercise uses a nominal, uncalibrated golimumab model and a calibrated nivolumab model </w:t>
+      </w:r>
+      <w:r>
+        <w:rPr>
+          <w:b w:val="false"/>
+          <w:color w:val="0046B4"/>
+        </w:rPr>
+        <w:t>representing models to simulate assumed “true” PK</w:t>
+      </w:r>
+      <w:r>
+        <w:rPr>
+          <w:b w:val="false"/>
+          <w:color w:val="0046B4"/>
+        </w:rPr>
+        <w:t>. Within each Monte Carlo replicate, one draw of five mechanistic inputs is shared across all animals and doses, whereas body weight and target reference concentration vary between monkeys. Candidate designs include two, three, or five dose groups and two, three, or six monkeys per group. The primary comparison is against each replicate's own dense-population mean; a secondary analysis compares with the fixed nominal typical subject. All 36 primary scenarios met the joint two-fold criterion in 100/100 replicates, while the secondary analysis showed lower success for AUC0-28d and clearance. The manuscript emphasizes that these results are conditional on the two truth models, variability distributions, sampling schedule, endpoints, and permissive tutorial criterion and do not define a universal minimum animal number.</w:t>
       </w:r>
     </w:p>
     <w:p>
@@ -539,37 +544,76 @@
       </w:pPr>
       <w:r>
         <w:rPr>
-          <w:color w:val="0046B4"/>
-        </w:rPr>
-        <w:t>We have re-framed the article as an implementation-focused tutorial. The main text now explains the workflow step by step, from mechanistic input collection and model construction through prediction, retrospective evaluation, and the conditional study-design simulation, with reproducible executable files and task-specific instructions in Supplementary Material 1. The analysis files were also reorganized to provide additional implementation detail. Because the available public data limited the dataset, the eight-antibody analysis is presented as a retrospective illustration, without a claim of method novelty or broad validation.</w:t>
-      </w:r>
-    </w:p>
-    <w:p>
-      <w:pPr>
-        <w:pStyle w:val="BodyText"/>
-        <w:bidi w:val="0"/>
-        <w:spacing w:lineRule="auto" w:line="264" w:before="0" w:after="100"/>
-        <w:jc w:val="start"/>
-        <w:rPr>
-          <w:color w:val="0046B4"/>
-        </w:rPr>
-      </w:pPr>
-      <w:r>
-        <w:rPr>
-          <w:color w:val="0046B4"/>
-        </w:rPr>
-      </w:r>
-    </w:p>
-    <w:p>
-      <w:pPr>
-        <w:pStyle w:val="BodyText"/>
-        <w:bidi w:val="0"/>
-        <w:spacing w:lineRule="auto" w:line="264" w:before="0" w:after="100"/>
-        <w:jc w:val="start"/>
-        <w:rPr/>
-      </w:pPr>
-      <w:r>
-        <w:rPr/>
+          <w:b w:val="false"/>
+          <w:color w:val="0046B4"/>
+        </w:rPr>
+        <w:t>We re-framed the article as an implementation-focused tutorial. The main text now explains the workflow from mechanistic input collection and model construction through prediction, retrospective evaluation, and the conditional study-design simulation. It now includes explicit TMDD rate laws, an input-to-parameter mapping, a short esqlabsR code example, mechanistic within-target interpretation, and a reference to the local sensitivity analysis in Supplementary Material 2. The repository and supplement provide the complete executable workflow. Because public data limited the dataset, the eight-antibody analysis is presented as a retrospective illustration without a claim of method novelty or broad validation.</w:t>
+      </w:r>
+    </w:p>
+    <w:p>
+      <w:pPr>
+        <w:pStyle w:val="BodyText"/>
+        <w:bidi w:val="0"/>
+        <w:spacing w:lineRule="auto" w:line="264" w:before="0" w:after="100"/>
+        <w:jc w:val="start"/>
+        <w:rPr>
+          <w:color w:val="0046B4"/>
+        </w:rPr>
+      </w:pPr>
+      <w:r>
+        <w:rPr/>
+      </w:r>
+    </w:p>
+    <w:p>
+      <w:pPr>
+        <w:pStyle w:val="BodyText"/>
+        <w:rPr/>
+      </w:pPr>
+      <w:r>
+        <w:rPr>
+          <w:b/>
+        </w:rPr>
+        <w:t>Additional revisions made during manuscript verification</w:t>
+      </w:r>
+    </w:p>
+    <w:p>
+      <w:pPr>
+        <w:pStyle w:val="BodyText"/>
+        <w:rPr/>
+      </w:pPr>
+      <w:r>
+        <w:rPr>
+          <w:b w:val="false"/>
+          <w:color w:val="0046B4"/>
+        </w:rPr>
+        <w:t>Results verification: We report the matched-interval AUC0-tlast counts and the restricted clearance denominators consistently in the Abstract, Results, Application and Key Considerations, Conclusions, and this response letter.</w:t>
+      </w:r>
+    </w:p>
+    <w:p>
+      <w:pPr>
+        <w:pStyle w:val="BodyText"/>
+        <w:rPr/>
+      </w:pPr>
+      <w:r>
+        <w:rPr>
+          <w:b w:val="false"/>
+          <w:color w:val="0046B4"/>
+        </w:rPr>
+        <w:t>Sensitivity analysis: The main text now points readers to the local sensitivity analysis in Supplementary Material 2 and explains that clearance was most responsive to target reference concentration and target degradation rate for tocilizumab, with smaller effects in selected bevacizumab and avelumab scenarios and smaller effects of complex internalization across the evaluated cases.</w:t>
+      </w:r>
+    </w:p>
+    <w:p>
+      <w:pPr>
+        <w:pStyle w:val="BodyText"/>
+        <w:spacing w:lineRule="auto" w:line="276" w:before="0" w:after="140"/>
+        <w:rPr/>
+      </w:pPr>
+      <w:r>
+        <w:rPr>
+          <w:b w:val="false"/>
+          <w:color w:val="0046B4"/>
+        </w:rPr>
+        <w:t>Editorial consistency: We corrected the software name to ospsuite, cited the previously uncited Betts and Gosselin references, reordered all references by first appearance, corrected the AI statement to Figures 1 and 3, standardized narrative and table terminology from 'terminal clearance' to 'clearance,' removed narrative uses of 'a priori' from the main text, and corrected the remaining typographical and caption errors. The legacy 02_APriori_PBPK_Workflow directory name is retained only as a literal reproducibility path.</w:t>
       </w:r>
     </w:p>
     <w:sectPr>
@@ -609,7 +653,7 @@
     <w:pPr>
       <w:widowControl/>
       <w:suppressAutoHyphens w:val="true"/>
-      <w:overflowPunct w:val="false"/>
+      <w:overflowPunct w:val="true"/>
       <w:bidi w:val="0"/>
       <w:spacing w:before="0" w:after="0"/>
       <w:jc w:val="start"/>

</xml_diff>